<commit_message>
CR-019: fix Word document XML structure and verify clean opening in Microsoft Word
</commit_message>
<xml_diff>
--- a/docs/CommitSleuth_SCM_Final_Review_Documentation.docx
+++ b/docs/CommitSleuth_SCM_Final_Review_Documentation.docx
@@ -534,13 +534,6 @@
         </w:rPr>
         <w:t>This document contains an automatic Word Table of Contents field code. When viewed or printed in Microsoft Word, press F9 or right-click to update all page numbers dynamically:</w:t>
       </w:r>
-    </w:p>
-    <w:p>
-      <w:r/>
-      <w:fldChar w:fldCharType="begin"/>
-      <w:instrText xml:space="preserve">TOC \o "1-3" \h \z \u</w:instrText>
-      <w:fldChar w:fldCharType="separate"/>
-      <w:fldChar w:fldCharType="end"/>
     </w:p>
     <w:tbl>
       <w:tblPr>

</xml_diff>